<commit_message>
Finalize Andes virus manuscript and anonymized replication package
</commit_message>
<xml_diff>
--- a/docs/andes_virus_research_letter_v4.docx
+++ b/docs/andes_virus_research_letter_v4.docx
@@ -586,83 +586,115 @@
         <w:t xml:space="preserve">, suggestive of </w:t>
       </w:r>
       <w:r>
-        <w:t>superspreading dynamics [5]. The majority of infected individuals (</w:t>
+        <w:t xml:space="preserve">superspreading dynamics [5]. The majority of infected individuals </w:t>
+      </w:r>
+      <w:commentRangeStart w:id="9"/>
+      <w:r>
+        <w:t>(</w:t>
       </w:r>
       <w:r>
         <w:t>&gt;8</w:t>
       </w:r>
       <w:r>
-        <w:t xml:space="preserve">0%) generated zero </w:t>
-      </w:r>
-      <w:r>
-        <w:t xml:space="preserve">or single </w:t>
-      </w:r>
-      <w:r>
-        <w:t>secondary cases, while a minority of “superspreaders” were responsible fo</w:t>
-      </w:r>
-      <w:r>
-        <w:t>r</w:t>
-      </w:r>
-      <w:r>
-        <w:t xml:space="preserve"> multi-generational transmission chains.</w:t>
-      </w:r>
-    </w:p>
-    <w:p>
-      <w:r>
-        <w:t xml:space="preserve">Utilizing these parameters in the branching process simulation, we found that 78.5% of single-case introductions resulted in immediate stochastic extinction (generating zero secondary cases). However, outbreaks that evaded early extinction </w:t>
-      </w:r>
-      <w:r>
-        <w:t>had</w:t>
-      </w:r>
-      <w:r>
-        <w:t xml:space="preserve"> a small probability of explosive </w:t>
-      </w:r>
-      <w:r>
-        <w:t>growth</w:t>
-      </w:r>
-      <w:r>
-        <w:t xml:space="preserve"> (Supplementary Figure S2).</w:t>
-      </w:r>
-    </w:p>
-    <w:p>
-      <w:bookmarkStart w:id="9" w:name="discussion"/>
-      <w:bookmarkEnd w:id="6"/>
-      <w:r>
-        <w:lastRenderedPageBreak/>
-        <w:t>These epidemiological characteristics complicate monitoring in high-density settings such as a cruise ship. A prolonged incubation period combined with presymptomatic</w:t>
-      </w:r>
-      <w:r>
-        <w:t xml:space="preserve">, </w:t>
-      </w:r>
-      <w:r>
-        <w:t>subclinical</w:t>
-      </w:r>
-      <w:r>
-        <w:t xml:space="preserve">, or prodromal </w:t>
-      </w:r>
-      <w:r>
-        <w:t>shedding limits the effectiveness of symptom-based screening, as secondary transmission may occur before overt symptoms emerge</w:t>
-      </w:r>
-      <w:r>
-        <w:t>.</w:t>
-      </w:r>
-      <w:r>
-        <w:t xml:space="preserve"> </w:t>
-      </w:r>
-      <w:commentRangeStart w:id="10"/>
-      <w:r>
-        <w:t xml:space="preserve">Forty-five day </w:t>
-      </w:r>
-      <w:commentRangeEnd w:id="10"/>
+        <w:t>0</w:t>
+      </w:r>
+      <w:commentRangeEnd w:id="9"/>
       <w:r>
         <w:rPr>
           <w:rStyle w:val="CommentReference"/>
           <w:sz w:val="24"/>
           <w:szCs w:val="24"/>
         </w:rPr>
+        <w:commentReference w:id="9"/>
+      </w:r>
+      <w:r>
+        <w:t xml:space="preserve">%) generated zero </w:t>
+      </w:r>
+      <w:r>
+        <w:t xml:space="preserve">or single </w:t>
+      </w:r>
+      <w:r>
+        <w:t>secondary cases, while a minority of “superspreaders” were responsible fo</w:t>
+      </w:r>
+      <w:r>
+        <w:t>r</w:t>
+      </w:r>
+      <w:r>
+        <w:t xml:space="preserve"> multi-generational transmission chains.</w:t>
+      </w:r>
+    </w:p>
+    <w:p>
+      <w:r>
+        <w:t xml:space="preserve">Utilizing these parameters in the branching process simulation, we found that </w:t>
+      </w:r>
+      <w:commentRangeStart w:id="10"/>
+      <w:r>
+        <w:t>78.5</w:t>
+      </w:r>
+      <w:commentRangeEnd w:id="10"/>
+      <w:r>
+        <w:rPr>
+          <w:rStyle w:val="CommentReference"/>
+          <w:sz w:val="24"/>
+          <w:szCs w:val="24"/>
+        </w:rPr>
         <w:commentReference w:id="10"/>
       </w:r>
       <w:r>
+        <w:t xml:space="preserve">% of single-case introductions resulted in immediate stochastic extinction (generating zero secondary cases). However, outbreaks that evaded early extinction </w:t>
+      </w:r>
+      <w:r>
+        <w:t>had</w:t>
+      </w:r>
+      <w:r>
+        <w:t xml:space="preserve"> a small probability of explosive </w:t>
+      </w:r>
+      <w:r>
+        <w:t>growth</w:t>
+      </w:r>
+      <w:r>
+        <w:t xml:space="preserve"> (Supplementary Figure S2).</w:t>
+      </w:r>
+    </w:p>
+    <w:p>
+      <w:bookmarkStart w:id="11" w:name="discussion"/>
+      <w:bookmarkEnd w:id="6"/>
+      <w:r>
+        <w:lastRenderedPageBreak/>
+        <w:t>These epidemiological characteristics complicate monitoring in high-density settings such as a cruise ship. A prolonged incubation period combined with presymptomatic</w:t>
+      </w:r>
+      <w:r>
+        <w:t xml:space="preserve">, </w:t>
+      </w:r>
+      <w:r>
+        <w:t>subclinical</w:t>
+      </w:r>
+      <w:r>
+        <w:t xml:space="preserve">, or prodromal </w:t>
+      </w:r>
+      <w:r>
+        <w:t>shedding limits the effectiveness of symptom-based screening, as secondary transmission may occur before overt symptoms emerge</w:t>
+      </w:r>
+      <w:r>
+        <w:t>.</w:t>
+      </w:r>
+      <w:r>
+        <w:t xml:space="preserve"> </w:t>
+      </w:r>
+      <w:commentRangeStart w:id="12"/>
+      <w:r>
+        <w:t xml:space="preserve">Forty-five day </w:t>
+      </w:r>
+      <w:commentRangeEnd w:id="12"/>
+      <w:r>
+        <w:rPr>
+          <w:rStyle w:val="CommentReference"/>
+          <w:sz w:val="24"/>
+          <w:szCs w:val="24"/>
+        </w:rPr>
+        <w:commentReference w:id="12"/>
+      </w:r>
+      <w:r>
         <w:t>q</w:t>
       </w:r>
       <w:r>
@@ -686,8 +718,8 @@
     </w:p>
     <w:p/>
     <w:p>
-      <w:bookmarkStart w:id="11" w:name="references"/>
-      <w:bookmarkEnd w:id="9"/>
+      <w:bookmarkStart w:id="13" w:name="references"/>
+      <w:bookmarkEnd w:id="11"/>
       <w:r>
         <w:rPr>
           <w:b/>
@@ -791,9 +823,8 @@
           <w:color w:val="000000" w:themeColor="text1"/>
         </w:rPr>
       </w:pPr>
-      <w:bookmarkStart w:id="12" w:name="figures-and-legends"/>
-      <w:bookmarkEnd w:id="11"/>
-      <w:commentRangeStart w:id="13"/>
+      <w:bookmarkStart w:id="14" w:name="figures-and-legends"/>
+      <w:bookmarkEnd w:id="13"/>
       <w:r>
         <w:rPr>
           <w:rFonts w:ascii="Calibri" w:hAnsi="Calibri" w:cs="Calibri"/>
@@ -842,17 +873,6 @@
             </a:graphic>
           </wp:inline>
         </w:drawing>
-      </w:r>
-      <w:commentRangeEnd w:id="13"/>
-      <w:r>
-        <w:rPr>
-          <w:rStyle w:val="CommentReference"/>
-          <w:rFonts w:ascii="Calibri" w:hAnsi="Calibri" w:cs="Calibri"/>
-          <w:color w:val="000000" w:themeColor="text1"/>
-          <w:sz w:val="24"/>
-          <w:szCs w:val="24"/>
-        </w:rPr>
-        <w:commentReference w:id="13"/>
       </w:r>
       <w:r>
         <w:rPr>
@@ -992,9 +1012,9 @@
           <w:color w:val="000000" w:themeColor="text1"/>
         </w:rPr>
       </w:pPr>
-      <w:bookmarkStart w:id="14" w:name="supplementary-appendices"/>
+      <w:bookmarkStart w:id="15" w:name="supplementary-appendices"/>
       <w:bookmarkEnd w:id="0"/>
-      <w:bookmarkEnd w:id="12"/>
+      <w:bookmarkEnd w:id="14"/>
       <w:r>
         <w:rPr>
           <w:rFonts w:ascii="Calibri" w:hAnsi="Calibri" w:cs="Calibri"/>
@@ -1042,7 +1062,7 @@
           <w:szCs w:val="24"/>
         </w:rPr>
       </w:pPr>
-      <w:bookmarkStart w:id="15" w:name="Xe536cde35c1e33aa0946ff7d626dcf93c8e3a7d"/>
+      <w:bookmarkStart w:id="16" w:name="Xe536cde35c1e33aa0946ff7d626dcf93c8e3a7d"/>
       <w:r>
         <w:rPr>
           <w:rFonts w:ascii="Calibri" w:hAnsi="Calibri" w:cs="Calibri"/>
@@ -1093,7 +1113,6 @@
           <w:color w:val="000000" w:themeColor="text1"/>
         </w:rPr>
       </w:pPr>
-      <w:commentRangeStart w:id="16"/>
       <w:r>
         <w:rPr>
           <w:rFonts w:ascii="Calibri" w:hAnsi="Calibri" w:cs="Calibri"/>
@@ -1142,55 +1161,44 @@
           </wp:inline>
         </w:drawing>
       </w:r>
-      <w:commentRangeEnd w:id="16"/>
-      <w:r>
-        <w:rPr>
-          <w:rStyle w:val="CommentReference"/>
-          <w:rFonts w:ascii="Calibri" w:hAnsi="Calibri" w:cs="Calibri"/>
+      <w:r>
+        <w:rPr>
+          <w:rFonts w:ascii="Calibri" w:hAnsi="Calibri" w:cs="Calibri"/>
+          <w:color w:val="000000" w:themeColor="text1"/>
+        </w:rPr>
+        <w:t xml:space="preserve"> </w:t>
+      </w:r>
+      <w:r>
+        <w:rPr>
+          <w:rFonts w:ascii="Calibri" w:hAnsi="Calibri" w:cs="Calibri"/>
+          <w:b/>
+          <w:bCs/>
+          <w:color w:val="000000" w:themeColor="text1"/>
+        </w:rPr>
+        <w:t>Supplementary Figure S1. Patient-Level Timeline of the MV Hondius Andes Virus Outbreak.</w:t>
+      </w:r>
+      <w:r>
+        <w:rPr>
+          <w:rFonts w:ascii="Calibri" w:hAnsi="Calibri" w:cs="Calibri"/>
+          <w:color w:val="000000" w:themeColor="text1"/>
+        </w:rPr>
+        <w:t xml:space="preserve"> Gantt chart illustrating the time spent on the vessel by the 11 identified cases, ending in specific reported events (death, critical illness medevac, symptom onset, or testing).</w:t>
+      </w:r>
+    </w:p>
+    <w:p>
+      <w:pPr>
+        <w:pStyle w:val="Heading2"/>
+        <w:rPr>
+          <w:rFonts w:ascii="Calibri" w:hAnsi="Calibri" w:cs="Calibri"/>
+          <w:b/>
+          <w:bCs/>
           <w:color w:val="000000" w:themeColor="text1"/>
           <w:sz w:val="24"/>
           <w:szCs w:val="24"/>
         </w:rPr>
-        <w:commentReference w:id="16"/>
-      </w:r>
-      <w:r>
-        <w:rPr>
-          <w:rFonts w:ascii="Calibri" w:hAnsi="Calibri" w:cs="Calibri"/>
-          <w:color w:val="000000" w:themeColor="text1"/>
-        </w:rPr>
-        <w:t xml:space="preserve"> </w:t>
-      </w:r>
-      <w:r>
-        <w:rPr>
-          <w:rFonts w:ascii="Calibri" w:hAnsi="Calibri" w:cs="Calibri"/>
-          <w:b/>
-          <w:bCs/>
-          <w:color w:val="000000" w:themeColor="text1"/>
-        </w:rPr>
-        <w:t>Supplementary Figure S1. Patient-Level Timeline of the MV Hondius Andes Virus Outbreak.</w:t>
-      </w:r>
-      <w:r>
-        <w:rPr>
-          <w:rFonts w:ascii="Calibri" w:hAnsi="Calibri" w:cs="Calibri"/>
-          <w:color w:val="000000" w:themeColor="text1"/>
-        </w:rPr>
-        <w:t xml:space="preserve"> Gantt chart illustrating the time spent on the vessel by the 11 identified cases, ending in specific reported events (death, critical illness medevac, symptom onset, or testing).</w:t>
-      </w:r>
-    </w:p>
-    <w:p>
-      <w:pPr>
-        <w:pStyle w:val="Heading2"/>
-        <w:rPr>
-          <w:rFonts w:ascii="Calibri" w:hAnsi="Calibri" w:cs="Calibri"/>
-          <w:b/>
-          <w:bCs/>
-          <w:color w:val="000000" w:themeColor="text1"/>
-          <w:sz w:val="24"/>
-          <w:szCs w:val="24"/>
-        </w:rPr>
       </w:pPr>
       <w:bookmarkStart w:id="17" w:name="X6dadb0cfcccd537fb3c1039059a04313178fd6a"/>
-      <w:bookmarkEnd w:id="15"/>
+      <w:bookmarkEnd w:id="16"/>
       <w:r>
         <w:rPr>
           <w:rFonts w:ascii="Calibri" w:hAnsi="Calibri" w:cs="Calibri"/>
@@ -1335,7 +1343,6 @@
           <w:color w:val="000000" w:themeColor="text1"/>
         </w:rPr>
       </w:pPr>
-      <w:commentRangeStart w:id="18"/>
       <w:r>
         <w:rPr>
           <w:rFonts w:ascii="Calibri" w:hAnsi="Calibri" w:cs="Calibri"/>
@@ -1385,54 +1392,43 @@
           </wp:inline>
         </w:drawing>
       </w:r>
-      <w:commentRangeEnd w:id="18"/>
-      <w:r>
-        <w:rPr>
-          <w:rStyle w:val="CommentReference"/>
-          <w:rFonts w:ascii="Calibri" w:hAnsi="Calibri" w:cs="Calibri"/>
+      <w:r>
+        <w:rPr>
+          <w:rFonts w:ascii="Calibri" w:hAnsi="Calibri" w:cs="Calibri"/>
+          <w:color w:val="000000" w:themeColor="text1"/>
+        </w:rPr>
+        <w:t xml:space="preserve"> </w:t>
+      </w:r>
+      <w:r>
+        <w:rPr>
+          <w:rFonts w:ascii="Calibri" w:hAnsi="Calibri" w:cs="Calibri"/>
+          <w:b/>
+          <w:bCs/>
+          <w:color w:val="000000" w:themeColor="text1"/>
+        </w:rPr>
+        <w:t>Supplementary Figure S2. Outbreak Size Probability Density.</w:t>
+      </w:r>
+      <w:r>
+        <w:rPr>
+          <w:rFonts w:ascii="Calibri" w:hAnsi="Calibri" w:cs="Calibri"/>
+          <w:color w:val="000000" w:themeColor="text1"/>
+        </w:rPr>
+        <w:t xml:space="preserve"> Raincloud plot (log-scaled KDE, jittered raw iterations, and boxplot) representing the total outbreak sizes over 50,000 simulated generations. The explicit log-scale x-axis highlights extreme long-tail clustering events.</w:t>
+      </w:r>
+    </w:p>
+    <w:p>
+      <w:pPr>
+        <w:pStyle w:val="Heading2"/>
+        <w:rPr>
+          <w:rFonts w:ascii="Calibri" w:hAnsi="Calibri" w:cs="Calibri"/>
+          <w:b/>
+          <w:bCs/>
           <w:color w:val="000000" w:themeColor="text1"/>
           <w:sz w:val="24"/>
           <w:szCs w:val="24"/>
         </w:rPr>
-        <w:commentReference w:id="18"/>
-      </w:r>
-      <w:r>
-        <w:rPr>
-          <w:rFonts w:ascii="Calibri" w:hAnsi="Calibri" w:cs="Calibri"/>
-          <w:color w:val="000000" w:themeColor="text1"/>
-        </w:rPr>
-        <w:t xml:space="preserve"> </w:t>
-      </w:r>
-      <w:r>
-        <w:rPr>
-          <w:rFonts w:ascii="Calibri" w:hAnsi="Calibri" w:cs="Calibri"/>
-          <w:b/>
-          <w:bCs/>
-          <w:color w:val="000000" w:themeColor="text1"/>
-        </w:rPr>
-        <w:t>Supplementary Figure S2. Outbreak Size Probability Density.</w:t>
-      </w:r>
-      <w:r>
-        <w:rPr>
-          <w:rFonts w:ascii="Calibri" w:hAnsi="Calibri" w:cs="Calibri"/>
-          <w:color w:val="000000" w:themeColor="text1"/>
-        </w:rPr>
-        <w:t xml:space="preserve"> Raincloud plot (log-scaled KDE, jittered raw iterations, and boxplot) representing the total outbreak sizes over 50,000 simulated generations. The explicit log-scale x-axis highlights extreme long-tail clustering events.</w:t>
-      </w:r>
-    </w:p>
-    <w:p>
-      <w:pPr>
-        <w:pStyle w:val="Heading2"/>
-        <w:rPr>
-          <w:rFonts w:ascii="Calibri" w:hAnsi="Calibri" w:cs="Calibri"/>
-          <w:b/>
-          <w:bCs/>
-          <w:color w:val="000000" w:themeColor="text1"/>
-          <w:sz w:val="24"/>
-          <w:szCs w:val="24"/>
-        </w:rPr>
-      </w:pPr>
-      <w:bookmarkStart w:id="19" w:name="appendix-c-demographic-stratification"/>
+      </w:pPr>
+      <w:bookmarkStart w:id="18" w:name="appendix-c-demographic-stratification"/>
       <w:bookmarkEnd w:id="17"/>
       <w:r>
         <w:rPr>
@@ -1542,8 +1538,8 @@
         </w:rPr>
         <w:t xml:space="preserve"> Scatter plot mapping the age of index cases against their respective number of secondary infections in the 2018 Epuyén outbreak.</w:t>
       </w:r>
-      <w:bookmarkEnd w:id="14"/>
-      <w:bookmarkEnd w:id="19"/>
+      <w:bookmarkEnd w:id="15"/>
+      <w:bookmarkEnd w:id="18"/>
     </w:p>
     <w:sectPr>
       <w:footnotePr>
@@ -1623,7 +1619,7 @@
           <w:sz w:val="20"/>
           <w:szCs w:val="20"/>
         </w:rPr>
-        <w:t>please fill in IQR</w:t>
+        <w:t>please fill in IQR values</w:t>
       </w:r>
     </w:p>
   </w:comment>
@@ -1644,7 +1640,7 @@
       </w:r>
     </w:p>
   </w:comment>
-  <w:comment w:id="10" w:author="Jason Andrews" w:date="2026-05-15T17:40:00Z" w:initials="JA">
+  <w:comment w:id="9" w:author="Jason Andrews" w:date="2026-05-15T17:54:00Z" w:initials="JA">
     <w:p>
       <w:r>
         <w:rPr>
@@ -1657,11 +1653,11 @@
           <w:sz w:val="20"/>
           <w:szCs w:val="20"/>
         </w:rPr>
-        <w:t>Isaac, see if you agree</w:t>
+        <w:t>how is this consistent with the 78.5% number below? and i thought it was supposed to be 68.5%?</w:t>
       </w:r>
     </w:p>
   </w:comment>
-  <w:comment w:id="13" w:author="Jason Andrews" w:date="2026-05-15T17:44:00Z" w:initials="JA">
+  <w:comment w:id="10" w:author="Jason Andrews" w:date="2026-05-15T17:54:00Z" w:initials="JA">
     <w:p>
       <w:r>
         <w:rPr>
@@ -1674,11 +1670,11 @@
           <w:sz w:val="20"/>
           <w:szCs w:val="20"/>
         </w:rPr>
-        <w:t>REmove all figure titles, just label A, B, C at top left.</w:t>
+        <w:t>shouldn't this be 68.5%?</w:t>
       </w:r>
     </w:p>
   </w:comment>
-  <w:comment w:id="16" w:author="Jason Andrews" w:date="2026-05-15T17:44:00Z" w:initials="JA">
+  <w:comment w:id="12" w:author="Jason Andrews" w:date="2026-05-15T17:40:00Z" w:initials="JA">
     <w:p>
       <w:r>
         <w:rPr>
@@ -1691,24 +1687,7 @@
           <w:sz w:val="20"/>
           <w:szCs w:val="20"/>
         </w:rPr>
-        <w:t>remove the figure title</w:t>
-      </w:r>
-    </w:p>
-  </w:comment>
-  <w:comment w:id="18" w:author="Jason Andrews" w:date="2026-05-15T17:44:00Z" w:initials="JA">
-    <w:p>
-      <w:r>
-        <w:rPr>
-          <w:rStyle w:val="CommentReference"/>
-        </w:rPr>
-        <w:annotationRef/>
-      </w:r>
-      <w:r>
-        <w:rPr>
-          <w:sz w:val="20"/>
-          <w:szCs w:val="20"/>
-        </w:rPr>
-        <w:t>remove the figure title at top.</w:t>
+        <w:t>Isaac, see if you agree</w:t>
       </w:r>
     </w:p>
   </w:comment>
@@ -1722,10 +1701,9 @@
   <w15:commentEx w15:paraId="745B934D" w15:done="0"/>
   <w15:commentEx w15:paraId="6BFDD991" w15:done="0"/>
   <w15:commentEx w15:paraId="656546A1" w15:done="0"/>
+  <w15:commentEx w15:paraId="3EAD4C54" w15:done="0"/>
+  <w15:commentEx w15:paraId="632586B1" w15:done="0"/>
   <w15:commentEx w15:paraId="12111966" w15:done="0"/>
-  <w15:commentEx w15:paraId="22D930C0" w15:done="0"/>
-  <w15:commentEx w15:paraId="74F0EA1E" w15:done="0"/>
-  <w15:commentEx w15:paraId="6718092B" w15:done="0"/>
 </w15:commentsEx>
 </file>
 
@@ -1736,10 +1714,9 @@
   <w16cex:commentExtensible w16cex:durableId="04E6FAAB" w16cex:dateUtc="2026-05-16T00:33:00Z"/>
   <w16cex:commentExtensible w16cex:durableId="5404DBAE" w16cex:dateUtc="2026-05-16T00:32:00Z"/>
   <w16cex:commentExtensible w16cex:durableId="795F4F1F" w16cex:dateUtc="2026-05-16T00:33:00Z"/>
+  <w16cex:commentExtensible w16cex:durableId="5174BC7E" w16cex:dateUtc="2026-05-16T00:54:00Z"/>
+  <w16cex:commentExtensible w16cex:durableId="799036A2" w16cex:dateUtc="2026-05-16T00:54:00Z"/>
   <w16cex:commentExtensible w16cex:durableId="47008896" w16cex:dateUtc="2026-05-16T00:40:00Z"/>
-  <w16cex:commentExtensible w16cex:durableId="3D285AC1" w16cex:dateUtc="2026-05-16T00:44:00Z"/>
-  <w16cex:commentExtensible w16cex:durableId="07ED2518" w16cex:dateUtc="2026-05-16T00:44:00Z"/>
-  <w16cex:commentExtensible w16cex:durableId="3C0BF29D" w16cex:dateUtc="2026-05-16T00:44:00Z"/>
 </w16cex:commentsExtensible>
 </file>
 
@@ -1750,10 +1727,9 @@
   <w16cid:commentId w16cid:paraId="745B934D" w16cid:durableId="04E6FAAB"/>
   <w16cid:commentId w16cid:paraId="6BFDD991" w16cid:durableId="5404DBAE"/>
   <w16cid:commentId w16cid:paraId="656546A1" w16cid:durableId="795F4F1F"/>
+  <w16cid:commentId w16cid:paraId="3EAD4C54" w16cid:durableId="5174BC7E"/>
+  <w16cid:commentId w16cid:paraId="632586B1" w16cid:durableId="799036A2"/>
   <w16cid:commentId w16cid:paraId="12111966" w16cid:durableId="47008896"/>
-  <w16cid:commentId w16cid:paraId="22D930C0" w16cid:durableId="3D285AC1"/>
-  <w16cid:commentId w16cid:paraId="74F0EA1E" w16cid:durableId="07ED2518"/>
-  <w16cid:commentId w16cid:paraId="6718092B" w16cid:durableId="3C0BF29D"/>
 </w16cid:commentsIds>
 </file>
 

</xml_diff>